<commit_message>
finished shortHW2, need to check with someone
</commit_message>
<xml_diff>
--- a/HW1_WET/213382104-325028876.docx
+++ b/HW1_WET/213382104-325028876.docx
@@ -230,7 +230,6 @@
         </w:rPr>
         <w:t xml:space="preserve">Load the dataset into a Pandas </w:t>
       </w:r>
-      <w:proofErr w:type="spellStart"/>
       <w:r>
         <w:rPr>
           <w:rFonts w:asciiTheme="minorBidi" w:eastAsia="Courier New" w:hAnsiTheme="minorBidi" w:cstheme="minorBidi"/>
@@ -240,7 +239,6 @@
         </w:rPr>
         <w:t>DataFrame</w:t>
       </w:r>
-      <w:proofErr w:type="spellEnd"/>
       <w:r>
         <w:rPr>
           <w:rFonts w:asciiTheme="minorBidi" w:hAnsiTheme="minorBidi" w:cstheme="minorBidi"/>
@@ -410,7 +408,6 @@
         </w:rPr>
         <w:t xml:space="preserve">Print the </w:t>
       </w:r>
-      <w:proofErr w:type="spellStart"/>
       <w:r>
         <w:rPr>
           <w:rFonts w:asciiTheme="minorBidi" w:eastAsia="Courier New" w:hAnsiTheme="minorBidi" w:cstheme="minorBidi"/>
@@ -420,7 +417,6 @@
         </w:rPr>
         <w:t>value_counts</w:t>
       </w:r>
-      <w:proofErr w:type="spellEnd"/>
       <w:r>
         <w:rPr>
           <w:rFonts w:asciiTheme="minorBidi" w:hAnsiTheme="minorBidi" w:cstheme="minorBidi"/>
@@ -430,7 +426,6 @@
         </w:rPr>
         <w:t xml:space="preserve"> of the </w:t>
       </w:r>
-      <w:proofErr w:type="spellStart"/>
       <w:r>
         <w:rPr>
           <w:rFonts w:asciiTheme="minorBidi" w:eastAsia="Courier New" w:hAnsiTheme="minorBidi" w:cstheme="minorBidi"/>
@@ -440,7 +435,6 @@
         </w:rPr>
         <w:t>conversations_per_day</w:t>
       </w:r>
-      <w:proofErr w:type="spellEnd"/>
       <w:r>
         <w:rPr>
           <w:rFonts w:asciiTheme="minorBidi" w:hAnsiTheme="minorBidi" w:cstheme="minorBidi"/>
@@ -518,7 +512,6 @@
           <w:lang w:val="en-IL"/>
         </w:rPr>
       </w:pPr>
-      <w:proofErr w:type="spellStart"/>
       <w:r>
         <w:rPr>
           <w:rFonts w:asciiTheme="minorBidi" w:eastAsia="Times New Roman" w:hAnsiTheme="minorBidi" w:cstheme="minorBidi"/>
@@ -529,7 +522,6 @@
         </w:rPr>
         <w:t>conversations_per_day</w:t>
       </w:r>
-      <w:proofErr w:type="spellEnd"/>
     </w:p>
     <w:p>
       <w:pPr>
@@ -954,29 +946,7 @@
           <w:szCs w:val="21"/>
           <w:lang w:val="en-IL"/>
         </w:rPr>
-        <w:t xml:space="preserve">Name: count, </w:t>
-      </w:r>
-      <w:proofErr w:type="spellStart"/>
-      <w:r>
-        <w:rPr>
-          <w:rFonts w:asciiTheme="minorBidi" w:eastAsia="Times New Roman" w:hAnsiTheme="minorBidi" w:cstheme="minorBidi"/>
-          <w:color w:val="156082" w:themeColor="accent1"/>
-          <w:sz w:val="21"/>
-          <w:szCs w:val="21"/>
-          <w:lang w:val="en-IL"/>
-        </w:rPr>
-        <w:t>dtype</w:t>
-      </w:r>
-      <w:proofErr w:type="spellEnd"/>
-      <w:r>
-        <w:rPr>
-          <w:rFonts w:asciiTheme="minorBidi" w:eastAsia="Times New Roman" w:hAnsiTheme="minorBidi" w:cstheme="minorBidi"/>
-          <w:color w:val="156082" w:themeColor="accent1"/>
-          <w:sz w:val="21"/>
-          <w:szCs w:val="21"/>
-          <w:lang w:val="en-IL"/>
-        </w:rPr>
-        <w:t>: int64</w:t>
+        <w:t>Name: count, dtype: int64</w:t>
       </w:r>
     </w:p>
     <w:p>
@@ -1526,7 +1496,6 @@
                 <w:szCs w:val="24"/>
               </w:rPr>
             </w:pPr>
-            <w:proofErr w:type="spellStart"/>
             <w:r>
               <w:rPr>
                 <w:rFonts w:asciiTheme="minorBidi" w:hAnsiTheme="minorBidi" w:cstheme="minorBidi"/>
@@ -1536,7 +1505,6 @@
               </w:rPr>
               <w:t>patient_id</w:t>
             </w:r>
-            <w:proofErr w:type="spellEnd"/>
           </w:p>
         </w:tc>
         <w:tc>
@@ -1838,7 +1806,6 @@
                 <w:szCs w:val="24"/>
               </w:rPr>
             </w:pPr>
-            <w:proofErr w:type="spellStart"/>
             <w:r>
               <w:rPr>
                 <w:rFonts w:asciiTheme="minorBidi" w:hAnsiTheme="minorBidi" w:cstheme="minorBidi"/>
@@ -1848,7 +1815,6 @@
               </w:rPr>
               <w:t>blood_type</w:t>
             </w:r>
-            <w:proofErr w:type="spellEnd"/>
           </w:p>
         </w:tc>
         <w:tc>
@@ -1916,7 +1882,6 @@
                 <w:szCs w:val="24"/>
               </w:rPr>
             </w:pPr>
-            <w:proofErr w:type="spellStart"/>
             <w:r>
               <w:rPr>
                 <w:rFonts w:asciiTheme="minorBidi" w:hAnsiTheme="minorBidi" w:cstheme="minorBidi"/>
@@ -1926,7 +1891,6 @@
               </w:rPr>
               <w:t>current_location</w:t>
             </w:r>
-            <w:proofErr w:type="spellEnd"/>
           </w:p>
         </w:tc>
         <w:tc>
@@ -1997,7 +1961,6 @@
                 <w:szCs w:val="24"/>
               </w:rPr>
             </w:pPr>
-            <w:proofErr w:type="spellStart"/>
             <w:r>
               <w:rPr>
                 <w:rFonts w:asciiTheme="minorBidi" w:hAnsiTheme="minorBidi" w:cstheme="minorBidi"/>
@@ -2007,7 +1970,6 @@
               </w:rPr>
               <w:t>num_of_siblings</w:t>
             </w:r>
-            <w:proofErr w:type="spellEnd"/>
           </w:p>
         </w:tc>
         <w:tc>
@@ -2085,7 +2047,6 @@
                 <w:szCs w:val="24"/>
               </w:rPr>
             </w:pPr>
-            <w:proofErr w:type="spellStart"/>
             <w:r>
               <w:rPr>
                 <w:rFonts w:asciiTheme="minorBidi" w:hAnsiTheme="minorBidi" w:cstheme="minorBidi"/>
@@ -2095,7 +2056,6 @@
               </w:rPr>
               <w:t>happiness_score</w:t>
             </w:r>
-            <w:proofErr w:type="spellEnd"/>
           </w:p>
         </w:tc>
         <w:tc>
@@ -2166,7 +2126,6 @@
                 <w:szCs w:val="24"/>
               </w:rPr>
             </w:pPr>
-            <w:proofErr w:type="spellStart"/>
             <w:r>
               <w:rPr>
                 <w:rFonts w:asciiTheme="minorBidi" w:hAnsiTheme="minorBidi" w:cstheme="minorBidi"/>
@@ -2176,7 +2135,6 @@
               </w:rPr>
               <w:t>household_income</w:t>
             </w:r>
-            <w:proofErr w:type="spellEnd"/>
           </w:p>
         </w:tc>
         <w:tc>
@@ -2260,7 +2218,6 @@
                 <w:szCs w:val="24"/>
               </w:rPr>
             </w:pPr>
-            <w:proofErr w:type="spellStart"/>
             <w:r>
               <w:rPr>
                 <w:rFonts w:asciiTheme="minorBidi" w:hAnsiTheme="minorBidi" w:cstheme="minorBidi"/>
@@ -2270,7 +2227,6 @@
               </w:rPr>
               <w:t>conversations_per_day</w:t>
             </w:r>
-            <w:proofErr w:type="spellEnd"/>
           </w:p>
         </w:tc>
         <w:tc>
@@ -2341,7 +2297,6 @@
                 <w:szCs w:val="24"/>
               </w:rPr>
             </w:pPr>
-            <w:proofErr w:type="spellStart"/>
             <w:r>
               <w:rPr>
                 <w:rFonts w:asciiTheme="minorBidi" w:hAnsiTheme="minorBidi" w:cstheme="minorBidi"/>
@@ -2351,7 +2306,6 @@
               </w:rPr>
               <w:t>sugar_levels</w:t>
             </w:r>
-            <w:proofErr w:type="spellEnd"/>
           </w:p>
         </w:tc>
         <w:tc>
@@ -2419,7 +2373,6 @@
                 <w:szCs w:val="24"/>
               </w:rPr>
             </w:pPr>
-            <w:proofErr w:type="spellStart"/>
             <w:r>
               <w:rPr>
                 <w:rFonts w:asciiTheme="minorBidi" w:hAnsiTheme="minorBidi" w:cstheme="minorBidi"/>
@@ -2429,7 +2382,6 @@
               </w:rPr>
               <w:t>sport_activity</w:t>
             </w:r>
-            <w:proofErr w:type="spellEnd"/>
           </w:p>
         </w:tc>
         <w:tc>
@@ -2516,7 +2468,6 @@
                 <w:szCs w:val="24"/>
               </w:rPr>
             </w:pPr>
-            <w:proofErr w:type="spellStart"/>
             <w:r>
               <w:rPr>
                 <w:rFonts w:asciiTheme="minorBidi" w:hAnsiTheme="minorBidi" w:cstheme="minorBidi"/>
@@ -2526,7 +2477,6 @@
               </w:rPr>
               <w:t>pcr_date</w:t>
             </w:r>
-            <w:proofErr w:type="spellEnd"/>
           </w:p>
         </w:tc>
         <w:tc>
@@ -3449,7 +3399,6 @@
         </w:rPr>
         <w:t xml:space="preserve">) and a test set (20% of the data). As the </w:t>
       </w:r>
-      <w:proofErr w:type="spellStart"/>
       <w:r>
         <w:rPr>
           <w:rFonts w:asciiTheme="minorBidi" w:eastAsia="Courier New" w:hAnsiTheme="minorBidi" w:cstheme="minorBidi"/>
@@ -3459,7 +3408,6 @@
         </w:rPr>
         <w:t>random_state</w:t>
       </w:r>
-      <w:proofErr w:type="spellEnd"/>
       <w:r>
         <w:rPr>
           <w:rFonts w:asciiTheme="minorBidi" w:hAnsiTheme="minorBidi" w:cstheme="minorBidi"/>
@@ -3691,7 +3639,6 @@
         <w:t xml:space="preserve">, report which fields have missing values and how many missing values there are. You can use Panda's function </w:t>
       </w:r>
       <w:hyperlink r:id="rId8">
-        <w:proofErr w:type="spellStart"/>
         <w:r>
           <w:rPr>
             <w:rFonts w:asciiTheme="minorBidi" w:hAnsiTheme="minorBidi" w:cstheme="minorBidi"/>
@@ -3700,18 +3647,7 @@
             <w:szCs w:val="24"/>
             <w:u w:val="single"/>
           </w:rPr>
-          <w:t>isnull</w:t>
-        </w:r>
-        <w:proofErr w:type="spellEnd"/>
-        <w:r>
-          <w:rPr>
-            <w:rFonts w:asciiTheme="minorBidi" w:hAnsiTheme="minorBidi" w:cstheme="minorBidi"/>
-            <w:color w:val="1155CC"/>
-            <w:sz w:val="24"/>
-            <w:szCs w:val="24"/>
-            <w:u w:val="single"/>
-          </w:rPr>
-          <w:t>()</w:t>
+          <w:t>isnull()</w:t>
         </w:r>
       </w:hyperlink>
       <w:r>
@@ -3752,27 +3688,7 @@
           <w:sz w:val="24"/>
           <w:szCs w:val="24"/>
         </w:rPr>
-        <w:t xml:space="preserve">The only field that has missing values is “ </w:t>
-      </w:r>
-      <w:proofErr w:type="spellStart"/>
-      <w:r>
-        <w:rPr>
-          <w:rFonts w:asciiTheme="minorBidi" w:hAnsiTheme="minorBidi" w:cstheme="minorBidi"/>
-          <w:color w:val="156082" w:themeColor="accent1"/>
-          <w:sz w:val="24"/>
-          <w:szCs w:val="24"/>
-        </w:rPr>
-        <w:t>household_income</w:t>
-      </w:r>
-      <w:proofErr w:type="spellEnd"/>
-      <w:r>
-        <w:rPr>
-          <w:rFonts w:asciiTheme="minorBidi" w:hAnsiTheme="minorBidi" w:cstheme="minorBidi"/>
-          <w:color w:val="156082" w:themeColor="accent1"/>
-          <w:sz w:val="24"/>
-          <w:szCs w:val="24"/>
-        </w:rPr>
-        <w:t>” with 109 missing values.</w:t>
+        <w:t>The only field that has missing values is “ household_income” with 109 missing values.</w:t>
       </w:r>
     </w:p>
     <w:p>
@@ -4610,17 +4526,8 @@
           <w:rFonts w:asciiTheme="minorBidi" w:hAnsiTheme="minorBidi" w:cstheme="minorBidi"/>
           <w:color w:val="156082" w:themeColor="accent1"/>
         </w:rPr>
-        <w:t xml:space="preserve">As a result we choose to fill the </w:t>
-      </w:r>
-      <w:proofErr w:type="spellStart"/>
-      <w:r>
-        <w:rPr>
-          <w:rFonts w:asciiTheme="minorBidi" w:hAnsiTheme="minorBidi" w:cstheme="minorBidi"/>
-          <w:color w:val="156082" w:themeColor="accent1"/>
-        </w:rPr>
-        <w:t>NaN’s</w:t>
-      </w:r>
-      <w:proofErr w:type="spellEnd"/>
+        <w:t>As a result we choose to fill the NaN’s</w:t>
+      </w:r>
       <w:r>
         <w:rPr>
           <w:rFonts w:asciiTheme="minorBidi" w:hAnsiTheme="minorBidi" w:cstheme="minorBidi"/>
@@ -4770,7 +4677,6 @@
         <w:t xml:space="preserve">Attach the </w:t>
       </w:r>
       <w:hyperlink r:id="rId10">
-        <w:proofErr w:type="spellStart"/>
         <w:r>
           <w:rPr>
             <w:rFonts w:ascii="Courier New" w:eastAsia="Courier New" w:hAnsi="Courier New" w:cs="Courier New"/>
@@ -4781,7 +4687,6 @@
           </w:rPr>
           <w:t>seaborn.pairplot</w:t>
         </w:r>
-        <w:proofErr w:type="spellEnd"/>
       </w:hyperlink>
       <w:r>
         <w:rPr>
@@ -5139,7 +5044,6 @@
         </w:rPr>
         <w:t xml:space="preserve">? Explain. It is okay to “estimate” the complexity of python library functions. For instance, if you use </w:t>
       </w:r>
-      <w:proofErr w:type="spellStart"/>
       <w:r>
         <w:rPr>
           <w:rFonts w:ascii="Consolas" w:eastAsia="Consolas" w:hAnsi="Consolas" w:cs="Consolas"/>
@@ -5149,7 +5053,6 @@
         </w:rPr>
         <w:t>np.argsort</w:t>
       </w:r>
-      <w:proofErr w:type="spellEnd"/>
       <w:r>
         <w:rPr>
           <w:color w:val="000000"/>
@@ -5342,23 +5245,7 @@
           <w:rFonts w:asciiTheme="minorBidi" w:hAnsiTheme="minorBidi" w:cstheme="minorBidi"/>
           <w:color w:val="156082" w:themeColor="accent1"/>
         </w:rPr>
-        <w:t xml:space="preserve">Computing </w:t>
-      </w:r>
-      <w:proofErr w:type="spellStart"/>
-      <w:r>
-        <w:rPr>
-          <w:rFonts w:asciiTheme="minorBidi" w:hAnsiTheme="minorBidi" w:cstheme="minorBidi"/>
-          <w:color w:val="156082" w:themeColor="accent1"/>
-        </w:rPr>
-        <w:t>for m</w:t>
-      </w:r>
-      <w:proofErr w:type="spellEnd"/>
-      <w:r>
-        <w:rPr>
-          <w:rFonts w:asciiTheme="minorBidi" w:hAnsiTheme="minorBidi" w:cstheme="minorBidi"/>
-          <w:color w:val="156082" w:themeColor="accent1"/>
-        </w:rPr>
-        <w:t xml:space="preserve"> training data points the distance from a fixed point is O(d) operations per point. Totaling O(m*d)</w:t>
+        <w:t>Computing for m training data points the distance from a fixed point is O(d) operations per point. Totaling O(m*d)</w:t>
       </w:r>
     </w:p>
     <w:p>
@@ -5388,7 +5275,6 @@
         </w:rPr>
         <w:t xml:space="preserve">The function </w:t>
       </w:r>
-      <w:proofErr w:type="spellStart"/>
       <w:r>
         <w:rPr>
           <w:rFonts w:asciiTheme="minorBidi" w:eastAsia="Consolas" w:hAnsiTheme="minorBidi" w:cstheme="minorBidi"/>
@@ -5398,7 +5284,6 @@
         </w:rPr>
         <w:t>np.argpartition</w:t>
       </w:r>
-      <w:proofErr w:type="spellEnd"/>
       <w:r>
         <w:rPr>
           <w:rFonts w:asciiTheme="minorBidi" w:eastAsia="Consolas" w:hAnsiTheme="minorBidi" w:cstheme="minorBidi"/>
@@ -5482,9 +5367,8 @@
           <w:sz w:val="21"/>
           <w:szCs w:val="21"/>
         </w:rPr>
-        <w:t xml:space="preserve">) in the worst </w:t>
-      </w:r>
-      <w:proofErr w:type="spellStart"/>
+        <w:t>) in the worst case.</w:t>
+      </w:r>
       <w:r>
         <w:rPr>
           <w:rFonts w:asciiTheme="minorBidi" w:eastAsia="Consolas" w:hAnsiTheme="minorBidi" w:cstheme="minorBidi"/>
@@ -5492,7 +5376,7 @@
           <w:sz w:val="21"/>
           <w:szCs w:val="21"/>
         </w:rPr>
-        <w:t>case.</w:t>
+        <w:t xml:space="preserve">We assume it used the quick select algorithm for finding the k-th </w:t>
       </w:r>
       <w:r>
         <w:rPr>
@@ -5501,9 +5385,8 @@
           <w:sz w:val="21"/>
           <w:szCs w:val="21"/>
         </w:rPr>
-        <w:t>We</w:t>
-      </w:r>
-      <w:proofErr w:type="spellEnd"/>
+        <w:t>element, then</w:t>
+      </w:r>
       <w:r>
         <w:rPr>
           <w:rFonts w:asciiTheme="minorBidi" w:eastAsia="Consolas" w:hAnsiTheme="minorBidi" w:cstheme="minorBidi"/>
@@ -5511,65 +5394,7 @@
           <w:sz w:val="21"/>
           <w:szCs w:val="21"/>
         </w:rPr>
-        <w:t xml:space="preserve"> assume it used the quick select algorithm for finding the k-</w:t>
-      </w:r>
-      <w:proofErr w:type="spellStart"/>
-      <w:r>
-        <w:rPr>
-          <w:rFonts w:asciiTheme="minorBidi" w:eastAsia="Consolas" w:hAnsiTheme="minorBidi" w:cstheme="minorBidi"/>
-          <w:color w:val="156082" w:themeColor="accent1"/>
-          <w:sz w:val="21"/>
-          <w:szCs w:val="21"/>
-        </w:rPr>
-        <w:t>th</w:t>
-      </w:r>
-      <w:proofErr w:type="spellEnd"/>
-      <w:r>
-        <w:rPr>
-          <w:rFonts w:asciiTheme="minorBidi" w:eastAsia="Consolas" w:hAnsiTheme="minorBidi" w:cstheme="minorBidi"/>
-          <w:color w:val="156082" w:themeColor="accent1"/>
-          <w:sz w:val="21"/>
-          <w:szCs w:val="21"/>
-        </w:rPr>
-        <w:t xml:space="preserve"> </w:t>
-      </w:r>
-      <w:r>
-        <w:rPr>
-          <w:rFonts w:asciiTheme="minorBidi" w:eastAsia="Consolas" w:hAnsiTheme="minorBidi" w:cstheme="minorBidi"/>
-          <w:color w:val="156082" w:themeColor="accent1"/>
-          <w:sz w:val="21"/>
-          <w:szCs w:val="21"/>
-        </w:rPr>
-        <w:t>element, then</w:t>
-      </w:r>
-      <w:r>
-        <w:rPr>
-          <w:rFonts w:asciiTheme="minorBidi" w:eastAsia="Consolas" w:hAnsiTheme="minorBidi" w:cstheme="minorBidi"/>
-          <w:color w:val="156082" w:themeColor="accent1"/>
-          <w:sz w:val="21"/>
-          <w:szCs w:val="21"/>
-        </w:rPr>
-        <w:t xml:space="preserve"> going over the rest of the elements it added only the elements less than the k-</w:t>
-      </w:r>
-      <w:proofErr w:type="spellStart"/>
-      <w:r>
-        <w:rPr>
-          <w:rFonts w:asciiTheme="minorBidi" w:eastAsia="Consolas" w:hAnsiTheme="minorBidi" w:cstheme="minorBidi"/>
-          <w:color w:val="156082" w:themeColor="accent1"/>
-          <w:sz w:val="21"/>
-          <w:szCs w:val="21"/>
-        </w:rPr>
-        <w:t>th</w:t>
-      </w:r>
-      <w:proofErr w:type="spellEnd"/>
-      <w:r>
-        <w:rPr>
-          <w:rFonts w:asciiTheme="minorBidi" w:eastAsia="Consolas" w:hAnsiTheme="minorBidi" w:cstheme="minorBidi"/>
-          <w:color w:val="156082" w:themeColor="accent1"/>
-          <w:sz w:val="21"/>
-          <w:szCs w:val="21"/>
-        </w:rPr>
-        <w:t xml:space="preserve"> element to the left part of the partition. Done in O(</w:t>
+        <w:t xml:space="preserve"> going over the rest of the elements it added only the elements less than the k-th element to the left part of the partition. Done in O(</w:t>
       </w:r>
       <w:r>
         <w:rPr>
@@ -5701,47 +5526,7 @@
           <w:sz w:val="24"/>
           <w:szCs w:val="24"/>
         </w:rPr>
-        <w:t>O(</w:t>
-      </w:r>
-      <w:proofErr w:type="spellStart"/>
-      <w:r>
-        <w:rPr>
-          <w:rFonts w:asciiTheme="minorBidi" w:hAnsiTheme="minorBidi" w:cstheme="minorBidi"/>
-          <w:color w:val="156082" w:themeColor="accent1"/>
-          <w:sz w:val="24"/>
-          <w:szCs w:val="24"/>
-        </w:rPr>
-        <w:t>mlogm</w:t>
-      </w:r>
-      <w:proofErr w:type="spellEnd"/>
-      <w:r>
-        <w:rPr>
-          <w:rFonts w:asciiTheme="minorBidi" w:hAnsiTheme="minorBidi" w:cstheme="minorBidi"/>
-          <w:color w:val="156082" w:themeColor="accent1"/>
-          <w:sz w:val="24"/>
-          <w:szCs w:val="24"/>
-        </w:rPr>
-        <w:t>) complexity , the task can be done in O(</w:t>
-      </w:r>
-      <w:proofErr w:type="spellStart"/>
-      <w:r>
-        <w:rPr>
-          <w:rFonts w:asciiTheme="minorBidi" w:hAnsiTheme="minorBidi" w:cstheme="minorBidi"/>
-          <w:color w:val="156082" w:themeColor="accent1"/>
-          <w:sz w:val="24"/>
-          <w:szCs w:val="24"/>
-        </w:rPr>
-        <w:t>mlogm</w:t>
-      </w:r>
-      <w:proofErr w:type="spellEnd"/>
-      <w:r>
-        <w:rPr>
-          <w:rFonts w:asciiTheme="minorBidi" w:hAnsiTheme="minorBidi" w:cstheme="minorBidi"/>
-          <w:color w:val="156082" w:themeColor="accent1"/>
-          <w:sz w:val="24"/>
-          <w:szCs w:val="24"/>
-        </w:rPr>
-        <w:t>) worst case, instead of O(m^2) worst case with quick select.</w:t>
+        <w:t>O(mlogm) complexity , the task can be done in O(mlogm) worst case, instead of O(m^2) worst case with quick select.</w:t>
       </w:r>
     </w:p>
     <w:p>
@@ -5824,23 +5609,7 @@
           <w:rFonts w:asciiTheme="minorBidi" w:hAnsiTheme="minorBidi" w:cstheme="minorBidi"/>
           <w:color w:val="156082" w:themeColor="accent1"/>
         </w:rPr>
-        <w:t>On average : (quick select) O(m*</w:t>
-      </w:r>
-      <w:proofErr w:type="spellStart"/>
-      <w:r>
-        <w:rPr>
-          <w:rFonts w:asciiTheme="minorBidi" w:hAnsiTheme="minorBidi" w:cstheme="minorBidi"/>
-          <w:color w:val="156082" w:themeColor="accent1"/>
-        </w:rPr>
-        <w:t>d+m+k</w:t>
-      </w:r>
-      <w:proofErr w:type="spellEnd"/>
-      <w:r>
-        <w:rPr>
-          <w:rFonts w:asciiTheme="minorBidi" w:hAnsiTheme="minorBidi" w:cstheme="minorBidi"/>
-          <w:color w:val="156082" w:themeColor="accent1"/>
-        </w:rPr>
-        <w:t>), in other words: O(m*d) since k&lt;=m.</w:t>
+        <w:t>On average : (quick select) O(m*d+m+k), in other words: O(m*d) since k&lt;=m.</w:t>
       </w:r>
     </w:p>
     <w:p>
@@ -5860,39 +5629,7 @@
           <w:rFonts w:asciiTheme="minorBidi" w:hAnsiTheme="minorBidi" w:cstheme="minorBidi"/>
           <w:color w:val="156082" w:themeColor="accent1"/>
         </w:rPr>
-        <w:t>Worst case: (Sorting)) O(</w:t>
-      </w:r>
-      <w:proofErr w:type="spellStart"/>
-      <w:r>
-        <w:rPr>
-          <w:rFonts w:asciiTheme="minorBidi" w:hAnsiTheme="minorBidi" w:cstheme="minorBidi"/>
-          <w:color w:val="156082" w:themeColor="accent1"/>
-        </w:rPr>
-        <w:t>mlogm</w:t>
-      </w:r>
-      <w:proofErr w:type="spellEnd"/>
-      <w:r>
-        <w:rPr>
-          <w:rFonts w:asciiTheme="minorBidi" w:hAnsiTheme="minorBidi" w:cstheme="minorBidi"/>
-          <w:color w:val="156082" w:themeColor="accent1"/>
-        </w:rPr>
-        <w:t xml:space="preserve"> + m*d +k), since k&lt;=m, we really get : O(</w:t>
-      </w:r>
-      <w:proofErr w:type="spellStart"/>
-      <w:r>
-        <w:rPr>
-          <w:rFonts w:asciiTheme="minorBidi" w:hAnsiTheme="minorBidi" w:cstheme="minorBidi"/>
-          <w:color w:val="156082" w:themeColor="accent1"/>
-        </w:rPr>
-        <w:t>mlogm+m</w:t>
-      </w:r>
-      <w:proofErr w:type="spellEnd"/>
-      <w:r>
-        <w:rPr>
-          <w:rFonts w:asciiTheme="minorBidi" w:hAnsiTheme="minorBidi" w:cstheme="minorBidi"/>
-          <w:color w:val="156082" w:themeColor="accent1"/>
-        </w:rPr>
-        <w:t>*d)</w:t>
+        <w:t>Worst case: (Sorting)) O(mlogm + m*d +k), since k&lt;=m, we really get : O(mlogm+m*d)</w:t>
       </w:r>
     </w:p>
     <w:p>
@@ -6606,7 +6343,6 @@
         </w:rPr>
         <w:t xml:space="preserve">) to normalize the two features in the temporary </w:t>
       </w:r>
-      <w:proofErr w:type="spellStart"/>
       <w:r>
         <w:rPr>
           <w:rFonts w:ascii="Courier New" w:eastAsia="Courier New" w:hAnsi="Courier New" w:cs="Courier New"/>
@@ -6616,32 +6352,13 @@
         </w:rPr>
         <w:t>DataFrame</w:t>
       </w:r>
-      <w:proofErr w:type="spellEnd"/>
-      <w:r>
-        <w:rPr>
-          <w:color w:val="000000"/>
-          <w:sz w:val="24"/>
-          <w:szCs w:val="24"/>
-        </w:rPr>
-        <w:t xml:space="preserve"> you created before, and train a new </w:t>
-      </w:r>
-      <w:proofErr w:type="spellStart"/>
-      <w:r>
-        <w:rPr>
-          <w:color w:val="000000"/>
-          <w:sz w:val="24"/>
-          <w:szCs w:val="24"/>
-        </w:rPr>
-        <w:t>kNN</w:t>
-      </w:r>
-      <w:proofErr w:type="spellEnd"/>
-      <w:r>
-        <w:rPr>
-          <w:color w:val="000000"/>
-          <w:sz w:val="24"/>
-          <w:szCs w:val="24"/>
-        </w:rPr>
-        <w:t xml:space="preserve"> model (</w:t>
+      <w:r>
+        <w:rPr>
+          <w:color w:val="000000"/>
+          <w:sz w:val="24"/>
+          <w:szCs w:val="24"/>
+        </w:rPr>
+        <w:t xml:space="preserve"> you created before, and train a new kNN model (</w:t>
       </w:r>
       <m:oMath>
         <m:r>
@@ -7118,25 +6835,7 @@
           <w:szCs w:val="24"/>
         </w:rPr>
         <w:lastRenderedPageBreak/>
-        <w:t xml:space="preserve">Using the normalized dataset, train another </w:t>
-      </w:r>
-      <w:proofErr w:type="spellStart"/>
-      <w:r>
-        <w:rPr>
-          <w:color w:val="000000"/>
-          <w:sz w:val="24"/>
-          <w:szCs w:val="24"/>
-        </w:rPr>
-        <w:t>kNN</w:t>
-      </w:r>
-      <w:proofErr w:type="spellEnd"/>
-      <w:r>
-        <w:rPr>
-          <w:color w:val="000000"/>
-          <w:sz w:val="24"/>
-          <w:szCs w:val="24"/>
-        </w:rPr>
-        <w:t xml:space="preserve"> model with </w:t>
+        <w:t xml:space="preserve">Using the normalized dataset, train another kNN model with </w:t>
       </w:r>
       <m:oMath>
         <m:r>
@@ -7480,9 +7179,8 @@
           <w:sz w:val="22"/>
           <w:szCs w:val="22"/>
         </w:rPr>
-        <w:t xml:space="preserve"> decrease in training set accuracy because the 5-NN model averages the labels of the five nearest </w:t>
-      </w:r>
-      <w:proofErr w:type="spellStart"/>
+        <w:t xml:space="preserve"> decrease in training set accuracy because the 5-NN model averages the labels of the five nearest neighbors, leading to less overfitting. </w:t>
+      </w:r>
       <w:r>
         <w:rPr>
           <w:rFonts w:asciiTheme="minorBidi" w:hAnsiTheme="minorBidi" w:cstheme="minorBidi"/>
@@ -7490,9 +7188,8 @@
           <w:sz w:val="22"/>
           <w:szCs w:val="22"/>
         </w:rPr>
-        <w:t>neighbors</w:t>
-      </w:r>
-      <w:proofErr w:type="spellEnd"/>
+        <w:t>T</w:t>
+      </w:r>
       <w:r>
         <w:rPr>
           <w:rFonts w:asciiTheme="minorBidi" w:hAnsiTheme="minorBidi" w:cstheme="minorBidi"/>
@@ -7500,7 +7197,7 @@
           <w:sz w:val="22"/>
           <w:szCs w:val="22"/>
         </w:rPr>
-        <w:t xml:space="preserve">, leading to less overfitting. </w:t>
+        <w:t xml:space="preserve">he 5-NN model makes predictions based on a </w:t>
       </w:r>
       <w:r>
         <w:rPr>
@@ -7509,7 +7206,7 @@
           <w:sz w:val="22"/>
           <w:szCs w:val="22"/>
         </w:rPr>
-        <w:t>T</w:t>
+        <w:t>wider</w:t>
       </w:r>
       <w:r>
         <w:rPr>
@@ -7518,45 +7215,7 @@
           <w:sz w:val="22"/>
           <w:szCs w:val="22"/>
         </w:rPr>
-        <w:t xml:space="preserve">he 5-NN model makes predictions based on a </w:t>
-      </w:r>
-      <w:r>
-        <w:rPr>
-          <w:rFonts w:asciiTheme="minorBidi" w:hAnsiTheme="minorBidi" w:cstheme="minorBidi"/>
-          <w:color w:val="156082" w:themeColor="accent1"/>
-          <w:sz w:val="22"/>
-          <w:szCs w:val="22"/>
-        </w:rPr>
-        <w:t>wider</w:t>
-      </w:r>
-      <w:r>
-        <w:rPr>
-          <w:rFonts w:asciiTheme="minorBidi" w:hAnsiTheme="minorBidi" w:cstheme="minorBidi"/>
-          <w:color w:val="156082" w:themeColor="accent1"/>
-          <w:sz w:val="22"/>
-          <w:szCs w:val="22"/>
-        </w:rPr>
-        <w:t xml:space="preserve"> context from multiple </w:t>
-      </w:r>
-      <w:proofErr w:type="spellStart"/>
-      <w:r>
-        <w:rPr>
-          <w:rFonts w:asciiTheme="minorBidi" w:hAnsiTheme="minorBidi" w:cstheme="minorBidi"/>
-          <w:color w:val="156082" w:themeColor="accent1"/>
-          <w:sz w:val="22"/>
-          <w:szCs w:val="22"/>
-        </w:rPr>
-        <w:t>neighboring</w:t>
-      </w:r>
-      <w:proofErr w:type="spellEnd"/>
-      <w:r>
-        <w:rPr>
-          <w:rFonts w:asciiTheme="minorBidi" w:hAnsiTheme="minorBidi" w:cstheme="minorBidi"/>
-          <w:color w:val="156082" w:themeColor="accent1"/>
-          <w:sz w:val="22"/>
-          <w:szCs w:val="22"/>
-        </w:rPr>
-        <w:t xml:space="preserve"> </w:t>
+        <w:t xml:space="preserve"> context from multiple neighboring </w:t>
       </w:r>
       <w:r>
         <w:rPr>
@@ -7876,25 +7535,7 @@
           <w:sz w:val="24"/>
           <w:szCs w:val="24"/>
         </w:rPr>
-        <w:t>Assume a dataset with two features, one randomly sampled (</w:t>
-      </w:r>
-      <w:proofErr w:type="spellStart"/>
-      <w:r>
-        <w:rPr>
-          <w:color w:val="000000"/>
-          <w:sz w:val="24"/>
-          <w:szCs w:val="24"/>
-        </w:rPr>
-        <w:t>i.i.d.</w:t>
-      </w:r>
-      <w:proofErr w:type="spellEnd"/>
-      <w:r>
-        <w:rPr>
-          <w:color w:val="000000"/>
-          <w:sz w:val="24"/>
-          <w:szCs w:val="24"/>
-        </w:rPr>
-        <w:t xml:space="preserve">) from a uniform continuous distribution on the range </w:t>
+        <w:t xml:space="preserve">Assume a dataset with two features, one randomly sampled (i.i.d.) from a uniform continuous distribution on the range </w:t>
       </w:r>
       <m:oMath>
         <m:d>
@@ -8730,7 +8371,6 @@
         </w:rPr>
         <w:t xml:space="preserve">Split the (training) data based on the binary </w:t>
       </w:r>
-      <w:proofErr w:type="spellStart"/>
       <w:r>
         <w:rPr>
           <w:rFonts w:ascii="Courier New" w:eastAsia="Courier New" w:hAnsi="Courier New" w:cs="Courier New"/>
@@ -8740,7 +8380,6 @@
         </w:rPr>
         <w:t>SpecialProperty</w:t>
       </w:r>
-      <w:proofErr w:type="spellEnd"/>
       <w:r>
         <w:rPr>
           <w:color w:val="000000"/>
@@ -8938,7 +8577,6 @@
         </w:rPr>
         <w:t xml:space="preserve"> (with the partition according to the </w:t>
       </w:r>
-      <w:proofErr w:type="spellStart"/>
       <w:r>
         <w:rPr>
           <w:rFonts w:ascii="Courier New" w:eastAsia="Courier New" w:hAnsi="Courier New" w:cs="Courier New"/>
@@ -8948,7 +8586,6 @@
         </w:rPr>
         <w:t>SpecialProperty</w:t>
       </w:r>
-      <w:proofErr w:type="spellEnd"/>
       <w:r>
         <w:rPr>
           <w:color w:val="000000"/>
@@ -9035,43 +8672,7 @@
           <w:sz w:val="24"/>
           <w:szCs w:val="24"/>
         </w:rPr>
-        <w:t xml:space="preserve"> . </w:t>
-      </w:r>
-      <w:proofErr w:type="spellStart"/>
-      <w:r>
-        <w:rPr>
-          <w:color w:val="156082" w:themeColor="accent1"/>
-          <w:sz w:val="24"/>
-          <w:szCs w:val="24"/>
-        </w:rPr>
-        <w:t>Sice</w:t>
-      </w:r>
-      <w:proofErr w:type="spellEnd"/>
-      <w:r>
-        <w:rPr>
-          <w:color w:val="156082" w:themeColor="accent1"/>
-          <w:sz w:val="24"/>
-          <w:szCs w:val="24"/>
-        </w:rPr>
-        <w:t xml:space="preserve"> they separate the risk target well regardless of the </w:t>
-      </w:r>
-      <w:proofErr w:type="spellStart"/>
-      <w:r>
-        <w:rPr>
-          <w:color w:val="156082" w:themeColor="accent1"/>
-          <w:sz w:val="24"/>
-          <w:szCs w:val="24"/>
-        </w:rPr>
-        <w:t>SpecialProperty</w:t>
-      </w:r>
-      <w:proofErr w:type="spellEnd"/>
-      <w:r>
-        <w:rPr>
-          <w:color w:val="156082" w:themeColor="accent1"/>
-          <w:sz w:val="24"/>
-          <w:szCs w:val="24"/>
-        </w:rPr>
-        <w:t xml:space="preserve"> value.</w:t>
+        <w:t xml:space="preserve"> . Sice they separate the risk target well regardless of the SpecialProperty value.</w:t>
       </w:r>
     </w:p>
     <w:p>
@@ -9098,25 +8699,7 @@
           <w:sz w:val="24"/>
           <w:szCs w:val="24"/>
         </w:rPr>
-        <w:t xml:space="preserve">Other pairs seem to separate well if the </w:t>
-      </w:r>
-      <w:proofErr w:type="spellStart"/>
-      <w:r>
-        <w:rPr>
-          <w:color w:val="156082" w:themeColor="accent1"/>
-          <w:sz w:val="24"/>
-          <w:szCs w:val="24"/>
-        </w:rPr>
-        <w:t>SpecialProperty</w:t>
-      </w:r>
-      <w:proofErr w:type="spellEnd"/>
-      <w:r>
-        <w:rPr>
-          <w:color w:val="156082" w:themeColor="accent1"/>
-          <w:sz w:val="24"/>
-          <w:szCs w:val="24"/>
-        </w:rPr>
-        <w:t xml:space="preserve"> holds but not so well if it doesn’t. or </w:t>
+        <w:t xml:space="preserve">Other pairs seem to separate well if the SpecialProperty holds but not so well if it doesn’t. or </w:t>
       </w:r>
       <w:r>
         <w:rPr>
@@ -9235,7 +8818,6 @@
         </w:rPr>
         <w:t xml:space="preserve">, create three </w:t>
       </w:r>
-      <w:proofErr w:type="spellStart"/>
       <w:r>
         <w:rPr>
           <w:rFonts w:ascii="Courier New" w:eastAsia="Courier New" w:hAnsi="Courier New" w:cs="Courier New"/>
@@ -9251,16 +8833,7 @@
           <w:sz w:val="24"/>
           <w:szCs w:val="24"/>
         </w:rPr>
-        <w:t>s</w:t>
-      </w:r>
-      <w:proofErr w:type="spellEnd"/>
-      <w:r>
-        <w:rPr>
-          <w:color w:val="000000"/>
-          <w:sz w:val="24"/>
-          <w:szCs w:val="24"/>
-        </w:rPr>
-        <w:t xml:space="preserve"> </w:t>
+        <w:t xml:space="preserve">s </w:t>
       </w:r>
       <w:r>
         <w:rPr>
@@ -9295,7 +8868,6 @@
         </w:rPr>
         <w:t xml:space="preserve"> variable. The first </w:t>
       </w:r>
-      <w:proofErr w:type="spellStart"/>
       <w:r>
         <w:rPr>
           <w:rFonts w:ascii="Courier New" w:eastAsia="Courier New" w:hAnsi="Courier New" w:cs="Courier New"/>
@@ -9305,7 +8877,6 @@
         </w:rPr>
         <w:t>jointplot</w:t>
       </w:r>
-      <w:proofErr w:type="spellEnd"/>
       <w:r>
         <w:rPr>
           <w:color w:val="000000"/>
@@ -9365,7 +8936,6 @@
         </w:rPr>
         <w:t xml:space="preserve">. The second </w:t>
       </w:r>
-      <w:proofErr w:type="spellStart"/>
       <w:r>
         <w:rPr>
           <w:rFonts w:ascii="Courier New" w:eastAsia="Courier New" w:hAnsi="Courier New" w:cs="Courier New"/>
@@ -9375,7 +8945,6 @@
         </w:rPr>
         <w:t>jointplot</w:t>
       </w:r>
-      <w:proofErr w:type="spellEnd"/>
       <w:r>
         <w:rPr>
           <w:color w:val="000000"/>
@@ -9384,7 +8953,6 @@
         </w:rPr>
         <w:t xml:space="preserve"> should include only the data in the other blood group. The third </w:t>
       </w:r>
-      <w:proofErr w:type="spellStart"/>
       <w:r>
         <w:rPr>
           <w:rFonts w:ascii="Courier New" w:eastAsia="Courier New" w:hAnsi="Courier New" w:cs="Courier New"/>
@@ -9394,7 +8962,6 @@
         </w:rPr>
         <w:t>jointplot</w:t>
       </w:r>
-      <w:proofErr w:type="spellEnd"/>
       <w:r>
         <w:rPr>
           <w:b/>
@@ -9713,7 +9280,6 @@
         </w:rPr>
         <w:t xml:space="preserve">features you chose (axes X and Z) and the </w:t>
       </w:r>
-      <w:proofErr w:type="spellStart"/>
       <w:r>
         <w:rPr>
           <w:rFonts w:ascii="Courier New" w:eastAsia="Courier New" w:hAnsi="Courier New" w:cs="Courier New"/>
@@ -9723,7 +9289,6 @@
         </w:rPr>
         <w:t>SpecialProperty</w:t>
       </w:r>
-      <w:proofErr w:type="spellEnd"/>
       <w:r>
         <w:rPr>
           <w:color w:val="000000"/>
@@ -10202,15 +9767,17 @@
         </w:rPr>
         <w:t>Assuming no two points have the same features but different labels, in the normal case we will get 100% accuracy. In contrast, if we don’t consider the point itself as the closest point to itself, we could get a non-perfect score on the training data.</w:t>
       </w:r>
-      <w:r>
+    </w:p>
+    <w:p>
+      <w:pPr>
+        <w:pStyle w:val="NormalWeb"/>
         <w:rPr>
           <w:rFonts w:asciiTheme="minorBidi" w:hAnsiTheme="minorBidi" w:cstheme="minorBidi"/>
           <w:color w:val="156082" w:themeColor="accent1"/>
           <w:sz w:val="22"/>
           <w:szCs w:val="22"/>
         </w:rPr>
-        <w:br/>
-      </w:r>
+      </w:pPr>
       <w:r>
         <w:rPr>
           <w:rFonts w:asciiTheme="minorBidi" w:hAnsiTheme="minorBidi" w:cstheme="minorBidi"/>
@@ -10218,9 +9785,8 @@
           <w:sz w:val="22"/>
           <w:szCs w:val="22"/>
         </w:rPr>
-        <w:t xml:space="preserve">For example, if the training data contains two points with different features and different labels, each point would be </w:t>
-      </w:r>
-      <w:proofErr w:type="spellStart"/>
+        <w:br/>
+      </w:r>
       <w:r>
         <w:rPr>
           <w:rFonts w:asciiTheme="minorBidi" w:hAnsiTheme="minorBidi" w:cstheme="minorBidi"/>
@@ -10228,9 +9794,8 @@
           <w:sz w:val="22"/>
           <w:szCs w:val="22"/>
         </w:rPr>
-        <w:t>labeled</w:t>
-      </w:r>
-      <w:proofErr w:type="spellEnd"/>
+        <w:t xml:space="preserve">For example, </w:t>
+      </w:r>
       <w:r>
         <w:rPr>
           <w:rFonts w:asciiTheme="minorBidi" w:hAnsiTheme="minorBidi" w:cstheme="minorBidi"/>
@@ -10238,19 +9803,18 @@
           <w:sz w:val="22"/>
           <w:szCs w:val="22"/>
         </w:rPr>
-        <w:t xml:space="preserve"> </w:t>
-      </w:r>
-      <w:proofErr w:type="spellStart"/>
+        <w:t xml:space="preserve">Given a </w:t>
+      </w:r>
       <w:r>
         <w:rPr>
           <w:rFonts w:asciiTheme="minorBidi" w:hAnsiTheme="minorBidi" w:cstheme="minorBidi"/>
           <w:color w:val="156082" w:themeColor="accent1"/>
           <w:sz w:val="22"/>
           <w:szCs w:val="22"/>
-        </w:rPr>
-        <w:t>worng</w:t>
-      </w:r>
-      <w:proofErr w:type="spellEnd"/>
+          <w:u w:val="single"/>
+        </w:rPr>
+        <w:t>training</w:t>
+      </w:r>
       <w:r>
         <w:rPr>
           <w:rFonts w:asciiTheme="minorBidi" w:hAnsiTheme="minorBidi" w:cstheme="minorBidi"/>
@@ -10258,7 +9822,7 @@
           <w:sz w:val="22"/>
           <w:szCs w:val="22"/>
         </w:rPr>
-        <w:t xml:space="preserve"> and we will get</w:t>
+        <w:t xml:space="preserve"> </w:t>
       </w:r>
       <w:r>
         <w:rPr>
@@ -10267,7 +9831,7 @@
           <w:sz w:val="22"/>
           <w:szCs w:val="22"/>
         </w:rPr>
-        <w:t xml:space="preserve"> 0% accuracy on the training data</w:t>
+        <w:t xml:space="preserve">point </w:t>
       </w:r>
       <w:r>
         <w:rPr>
@@ -10276,15 +9840,110 @@
           <w:sz w:val="22"/>
           <w:szCs w:val="22"/>
         </w:rPr>
-        <w:t>.</w:t>
-      </w:r>
-    </w:p>
-    <w:p>
-      <w:pPr>
-        <w:rPr>
-          <w:lang w:val="en-IL"/>
-        </w:rPr>
-      </w:pPr>
+        <w:t xml:space="preserve"> </w:t>
+      </w:r>
+      <w:r>
+        <w:rPr>
+          <w:rFonts w:asciiTheme="minorBidi" w:hAnsiTheme="minorBidi" w:cstheme="minorBidi"/>
+          <w:color w:val="156082" w:themeColor="accent1"/>
+          <w:sz w:val="22"/>
+          <w:szCs w:val="22"/>
+          <w:u w:val="single"/>
+        </w:rPr>
+        <w:t>x</w:t>
+      </w:r>
+      <w:r>
+        <w:rPr>
+          <w:rFonts w:asciiTheme="minorBidi" w:hAnsiTheme="minorBidi" w:cstheme="minorBidi"/>
+          <w:color w:val="156082" w:themeColor="accent1"/>
+          <w:sz w:val="22"/>
+          <w:szCs w:val="22"/>
+        </w:rPr>
+        <w:t xml:space="preserve"> </w:t>
+      </w:r>
+      <w:r>
+        <w:rPr>
+          <w:rFonts w:asciiTheme="minorBidi" w:hAnsiTheme="minorBidi" w:cstheme="minorBidi"/>
+          <w:color w:val="156082" w:themeColor="accent1"/>
+          <w:sz w:val="22"/>
+          <w:szCs w:val="22"/>
+        </w:rPr>
+        <w:t>on the SpecialProperty == 1 plane, because of the huge scales of PCR_03 AND PCR_05 compared to the scale of SpecialProperty being bound by 0 and 1, the model might choose the closest point</w:t>
+      </w:r>
+      <w:r>
+        <w:rPr>
+          <w:rFonts w:asciiTheme="minorBidi" w:hAnsiTheme="minorBidi" w:cstheme="minorBidi"/>
+          <w:color w:val="156082" w:themeColor="accent1"/>
+          <w:sz w:val="22"/>
+          <w:szCs w:val="22"/>
+        </w:rPr>
+        <w:t xml:space="preserve"> to </w:t>
+      </w:r>
+      <w:r>
+        <w:rPr>
+          <w:rFonts w:asciiTheme="minorBidi" w:hAnsiTheme="minorBidi" w:cstheme="minorBidi"/>
+          <w:color w:val="156082" w:themeColor="accent1"/>
+          <w:sz w:val="22"/>
+          <w:szCs w:val="22"/>
+          <w:u w:val="single"/>
+        </w:rPr>
+        <w:t>x</w:t>
+      </w:r>
+      <w:r>
+        <w:rPr>
+          <w:rFonts w:asciiTheme="minorBidi" w:hAnsiTheme="minorBidi" w:cstheme="minorBidi"/>
+          <w:color w:val="156082" w:themeColor="accent1"/>
+          <w:sz w:val="22"/>
+          <w:szCs w:val="22"/>
+        </w:rPr>
+        <w:t xml:space="preserve"> being a point </w:t>
+      </w:r>
+      <w:r>
+        <w:rPr>
+          <w:rFonts w:asciiTheme="minorBidi" w:hAnsiTheme="minorBidi" w:cstheme="minorBidi"/>
+          <w:color w:val="156082" w:themeColor="accent1"/>
+          <w:sz w:val="22"/>
+          <w:szCs w:val="22"/>
+        </w:rPr>
+        <w:t>with SpecialProperty == 0. Since the distributions of the risk target  for SpecialProperty 1,0 don’t really match</w:t>
+      </w:r>
+      <w:r>
+        <w:rPr>
+          <w:rFonts w:asciiTheme="minorBidi" w:hAnsiTheme="minorBidi" w:cstheme="minorBidi"/>
+          <w:color w:val="156082" w:themeColor="accent1"/>
+          <w:sz w:val="22"/>
+          <w:szCs w:val="22"/>
+        </w:rPr>
+        <w:t>,and the model checks only for k=1 nearest neighbors</w:t>
+      </w:r>
+      <w:r>
+        <w:rPr>
+          <w:rFonts w:asciiTheme="minorBidi" w:hAnsiTheme="minorBidi" w:cstheme="minorBidi"/>
+          <w:color w:val="156082" w:themeColor="accent1"/>
+          <w:sz w:val="22"/>
+          <w:szCs w:val="22"/>
+        </w:rPr>
+        <w:t xml:space="preserve">, this may very well result in a miss matching of the the point </w:t>
+      </w:r>
+      <w:r>
+        <w:rPr>
+          <w:rFonts w:asciiTheme="minorBidi" w:hAnsiTheme="minorBidi" w:cstheme="minorBidi"/>
+          <w:color w:val="156082" w:themeColor="accent1"/>
+          <w:sz w:val="22"/>
+          <w:szCs w:val="22"/>
+          <w:u w:val="single"/>
+        </w:rPr>
+        <w:t>x</w:t>
+      </w:r>
+      <w:r>
+        <w:rPr>
+          <w:rFonts w:asciiTheme="minorBidi" w:hAnsiTheme="minorBidi" w:cstheme="minorBidi"/>
+          <w:color w:val="156082" w:themeColor="accent1"/>
+          <w:sz w:val="22"/>
+          <w:szCs w:val="22"/>
+        </w:rPr>
+        <w:t xml:space="preserve"> to a point with a different label of risk.  </w:t>
+      </w:r>
     </w:p>
     <w:p>
       <w:pPr>
@@ -10336,11 +9995,9 @@
             <w:tcW w:w="4675" w:type="dxa"/>
           </w:tcPr>
           <w:p>
-            <w:proofErr w:type="spellStart"/>
             <w:r>
               <w:t>MinMaxScaler</w:t>
             </w:r>
-            <w:proofErr w:type="spellEnd"/>
           </w:p>
         </w:tc>
         <w:tc>
@@ -10348,11 +10005,9 @@
             <w:tcW w:w="4675" w:type="dxa"/>
           </w:tcPr>
           <w:p>
-            <w:proofErr w:type="spellStart"/>
             <w:r>
               <w:t>StandardScaler</w:t>
             </w:r>
-            <w:proofErr w:type="spellEnd"/>
           </w:p>
         </w:tc>
       </w:tr>
@@ -10568,7 +10223,6 @@
           <w:sz w:val="24"/>
           <w:szCs w:val="24"/>
         </w:rPr>
-        <w:lastRenderedPageBreak/>
         <w:t xml:space="preserve">What will be the effects of data normalization on your answers in </w:t>
       </w:r>
       <w:r>
@@ -10821,7 +10475,6 @@
           <w:sz w:val="24"/>
           <w:szCs w:val="24"/>
         </w:rPr>
-        <w:lastRenderedPageBreak/>
         <w:t>Write a table summarizing the data preparation process you created.</w:t>
       </w:r>
     </w:p>
@@ -10974,7 +10627,6 @@
         </w:rPr>
         <w:t xml:space="preserve"> (e.g., </w:t>
       </w:r>
-      <w:proofErr w:type="spellStart"/>
       <w:r>
         <w:rPr>
           <w:rFonts w:ascii="Courier New" w:eastAsia="Courier New" w:hAnsi="Courier New" w:cs="Courier New"/>
@@ -10984,7 +10636,6 @@
         </w:rPr>
         <w:t>blood_type</w:t>
       </w:r>
-      <w:proofErr w:type="spellEnd"/>
       <w:r>
         <w:rPr>
           <w:color w:val="808080"/>
@@ -11144,7 +10795,6 @@
             <w:tcW w:w="2698" w:type="dxa"/>
           </w:tcPr>
           <w:p>
-            <w:proofErr w:type="spellStart"/>
             <w:r>
               <w:rPr>
                 <w:rFonts w:asciiTheme="minorBidi" w:hAnsiTheme="minorBidi" w:cstheme="minorBidi"/>
@@ -11154,7 +10804,6 @@
               </w:rPr>
               <w:t>patient_id</w:t>
             </w:r>
-            <w:proofErr w:type="spellEnd"/>
           </w:p>
         </w:tc>
         <w:tc>
@@ -11338,7 +10987,6 @@
             <w:tcW w:w="2698" w:type="dxa"/>
           </w:tcPr>
           <w:p>
-            <w:proofErr w:type="spellStart"/>
             <w:r>
               <w:rPr>
                 <w:rFonts w:asciiTheme="minorBidi" w:hAnsiTheme="minorBidi" w:cstheme="minorBidi"/>
@@ -11348,7 +10996,6 @@
               </w:rPr>
               <w:t>blood_type</w:t>
             </w:r>
-            <w:proofErr w:type="spellEnd"/>
           </w:p>
         </w:tc>
         <w:tc>
@@ -11388,7 +11035,6 @@
             <w:tcW w:w="2698" w:type="dxa"/>
           </w:tcPr>
           <w:p>
-            <w:proofErr w:type="spellStart"/>
             <w:r>
               <w:rPr>
                 <w:rFonts w:asciiTheme="minorBidi" w:hAnsiTheme="minorBidi" w:cstheme="minorBidi"/>
@@ -11398,7 +11044,6 @@
               </w:rPr>
               <w:t>current_location</w:t>
             </w:r>
-            <w:proofErr w:type="spellEnd"/>
           </w:p>
         </w:tc>
         <w:tc>
@@ -11438,7 +11083,6 @@
             <w:tcW w:w="2698" w:type="dxa"/>
           </w:tcPr>
           <w:p>
-            <w:proofErr w:type="spellStart"/>
             <w:r>
               <w:rPr>
                 <w:rFonts w:asciiTheme="minorBidi" w:hAnsiTheme="minorBidi" w:cstheme="minorBidi"/>
@@ -11448,7 +11092,6 @@
               </w:rPr>
               <w:t>num_of_siblings</w:t>
             </w:r>
-            <w:proofErr w:type="spellEnd"/>
           </w:p>
         </w:tc>
         <w:tc>
@@ -11488,7 +11131,6 @@
             <w:tcW w:w="2698" w:type="dxa"/>
           </w:tcPr>
           <w:p>
-            <w:proofErr w:type="spellStart"/>
             <w:r>
               <w:rPr>
                 <w:rFonts w:asciiTheme="minorBidi" w:hAnsiTheme="minorBidi" w:cstheme="minorBidi"/>
@@ -11498,7 +11140,6 @@
               </w:rPr>
               <w:t>happiness_score</w:t>
             </w:r>
-            <w:proofErr w:type="spellEnd"/>
           </w:p>
         </w:tc>
         <w:tc>
@@ -11538,7 +11179,6 @@
             <w:tcW w:w="2698" w:type="dxa"/>
           </w:tcPr>
           <w:p>
-            <w:proofErr w:type="spellStart"/>
             <w:r>
               <w:rPr>
                 <w:rFonts w:asciiTheme="minorBidi" w:hAnsiTheme="minorBidi" w:cstheme="minorBidi"/>
@@ -11548,7 +11188,6 @@
               </w:rPr>
               <w:t>household_income</w:t>
             </w:r>
-            <w:proofErr w:type="spellEnd"/>
           </w:p>
         </w:tc>
         <w:tc>
@@ -11588,7 +11227,6 @@
             <w:tcW w:w="2698" w:type="dxa"/>
           </w:tcPr>
           <w:p>
-            <w:proofErr w:type="spellStart"/>
             <w:r>
               <w:rPr>
                 <w:rFonts w:asciiTheme="minorBidi" w:hAnsiTheme="minorBidi" w:cstheme="minorBidi"/>
@@ -11598,7 +11236,6 @@
               </w:rPr>
               <w:t>conversations_per_day</w:t>
             </w:r>
-            <w:proofErr w:type="spellEnd"/>
           </w:p>
         </w:tc>
         <w:tc>
@@ -11638,7 +11275,6 @@
             <w:tcW w:w="2698" w:type="dxa"/>
           </w:tcPr>
           <w:p>
-            <w:proofErr w:type="spellStart"/>
             <w:r>
               <w:rPr>
                 <w:rFonts w:asciiTheme="minorBidi" w:hAnsiTheme="minorBidi" w:cstheme="minorBidi"/>
@@ -11648,7 +11284,6 @@
               </w:rPr>
               <w:t>sugar_levels</w:t>
             </w:r>
-            <w:proofErr w:type="spellEnd"/>
           </w:p>
         </w:tc>
         <w:tc>
@@ -11688,7 +11323,6 @@
             <w:tcW w:w="2698" w:type="dxa"/>
           </w:tcPr>
           <w:p>
-            <w:proofErr w:type="spellStart"/>
             <w:r>
               <w:rPr>
                 <w:rFonts w:asciiTheme="minorBidi" w:hAnsiTheme="minorBidi" w:cstheme="minorBidi"/>
@@ -11698,7 +11332,6 @@
               </w:rPr>
               <w:t>sport_activity</w:t>
             </w:r>
-            <w:proofErr w:type="spellEnd"/>
           </w:p>
         </w:tc>
         <w:tc>
@@ -11738,7 +11371,6 @@
             <w:tcW w:w="2698" w:type="dxa"/>
           </w:tcPr>
           <w:p>
-            <w:proofErr w:type="spellStart"/>
             <w:r>
               <w:rPr>
                 <w:rFonts w:asciiTheme="minorBidi" w:hAnsiTheme="minorBidi" w:cstheme="minorBidi"/>
@@ -11748,7 +11380,6 @@
               </w:rPr>
               <w:t>pcr_date</w:t>
             </w:r>
-            <w:proofErr w:type="spellEnd"/>
           </w:p>
         </w:tc>
         <w:tc>
@@ -11920,13 +11551,8 @@
             <w:tcW w:w="4142" w:type="dxa"/>
           </w:tcPr>
           <w:p>
-            <w:proofErr w:type="spellStart"/>
-            <w:r>
-              <w:t>MinMax</w:t>
-            </w:r>
-            <w:proofErr w:type="spellEnd"/>
-            <w:r>
-              <w:t xml:space="preserve"> scaling</w:t>
+            <w:r>
+              <w:t>MinMax scaling</w:t>
             </w:r>
           </w:p>
         </w:tc>
@@ -12261,13 +11887,8 @@
             <w:tcW w:w="4142" w:type="dxa"/>
           </w:tcPr>
           <w:p>
-            <w:proofErr w:type="spellStart"/>
-            <w:r>
-              <w:t>MinMax</w:t>
-            </w:r>
-            <w:proofErr w:type="spellEnd"/>
-            <w:r>
-              <w:t xml:space="preserve"> scaling</w:t>
+            <w:r>
+              <w:t>MinMax scaling</w:t>
             </w:r>
           </w:p>
         </w:tc>

</xml_diff>